<commit_message>
Article: email sign-up screenshots in step 2
Co-Authored-By: Claude Sonnet 5.5 <noreply@anthropic.com>
Claude-Session: https://claude.ai/code/session_01FNcg6BgDASctJZAAXYfBXy
</commit_message>
<xml_diff>
--- a/article-turkish-apple-id/article.docx
+++ b/article-turkish-apple-id/article.docx
@@ -496,6 +496,16 @@
       <w:r>
         <w:rPr>
           <w:rFonts w:ascii="Arial" w:cs="Arial" w:eastAsia="Arial" w:hAnsi="Arial"/>
+          <w:b/>
+          <w:bCs/>
+          <w:sz w:val="22"/>
+          <w:szCs w:val="22"/>
+        </w:rPr>
+        <w:t xml:space="preserve">1. </w:t>
+      </w:r>
+      <w:r>
+        <w:rPr>
+          <w:rFonts w:ascii="Arial" w:cs="Arial" w:eastAsia="Arial" w:hAnsi="Arial"/>
           <w:sz w:val="22"/>
           <w:szCs w:val="22"/>
         </w:rPr>
@@ -553,7 +563,7 @@
           <w:sz w:val="22"/>
           <w:szCs w:val="22"/>
         </w:rPr>
-        <w:t xml:space="preserve"> (выделено на скриншоте; может называться «Создать учётную запись Apple бесплатно»).</w:t>
+        <w:t xml:space="preserve"> (может называться «Создать учётную запись Apple бесплатно»).</w:t>
       </w:r>
     </w:p>
     <w:p>
@@ -573,15 +583,15 @@
           <w:sz w:val="22"/>
           <w:szCs w:val="22"/>
         </w:rPr>
-        <w:t xml:space="preserve">Почта и пароль. </w:t>
-      </w:r>
-      <w:r>
-        <w:rPr>
-          <w:rFonts w:ascii="Arial" w:cs="Arial" w:eastAsia="Arial" w:hAnsi="Arial"/>
-          <w:sz w:val="22"/>
-          <w:szCs w:val="22"/>
-        </w:rPr>
-        <w:t xml:space="preserve">Укажите новую почту и придумайте пароль: от 8 символов, с цифрой, заглавной и строчной буквой.</w:t>
+        <w:t xml:space="preserve">2. E-mail. </w:t>
+      </w:r>
+      <w:r>
+        <w:rPr>
+          <w:rFonts w:ascii="Arial" w:cs="Arial" w:eastAsia="Arial" w:hAnsi="Arial"/>
+          <w:sz w:val="22"/>
+          <w:szCs w:val="22"/>
+        </w:rPr>
+        <w:t xml:space="preserve">Введите новую почту, которую вы ещё не использовали для Apple ID. Она станет логином аккаунта.</w:t>
       </w:r>
     </w:p>
     <w:p>
@@ -601,15 +611,15 @@
           <w:sz w:val="22"/>
           <w:szCs w:val="22"/>
         </w:rPr>
-        <w:t xml:space="preserve">Страна или регион. </w:t>
-      </w:r>
-      <w:r>
-        <w:rPr>
-          <w:rFonts w:ascii="Arial" w:cs="Arial" w:eastAsia="Arial" w:hAnsi="Arial"/>
-          <w:sz w:val="22"/>
-          <w:szCs w:val="22"/>
-        </w:rPr>
-        <w:t xml:space="preserve">Выберите Турцию (Türkiye). Если выбор недоступен, регион сменим в шаге 3.</w:t>
+        <w:t xml:space="preserve">3. Пароль. </w:t>
+      </w:r>
+      <w:r>
+        <w:rPr>
+          <w:rFonts w:ascii="Arial" w:cs="Arial" w:eastAsia="Arial" w:hAnsi="Arial"/>
+          <w:sz w:val="22"/>
+          <w:szCs w:val="22"/>
+        </w:rPr>
+        <w:t xml:space="preserve">От 8 символов, минимум одна цифра, одна заглавная и одна строчная буква.</w:t>
       </w:r>
     </w:p>
     <w:p>
@@ -629,15 +639,15 @@
           <w:sz w:val="22"/>
           <w:szCs w:val="22"/>
         </w:rPr>
-        <w:t xml:space="preserve">Данные. </w:t>
-      </w:r>
-      <w:r>
-        <w:rPr>
-          <w:rFonts w:ascii="Arial" w:cs="Arial" w:eastAsia="Arial" w:hAnsi="Arial"/>
-          <w:sz w:val="22"/>
-          <w:szCs w:val="22"/>
-        </w:rPr>
-        <w:t xml:space="preserve">Имя и фамилия — любые, дата рождения — старше 18 лет. Примите условия.</w:t>
+        <w:t xml:space="preserve">Далее: </w:t>
+      </w:r>
+      <w:r>
+        <w:rPr>
+          <w:rFonts w:ascii="Arial" w:cs="Arial" w:eastAsia="Arial" w:hAnsi="Arial"/>
+          <w:sz w:val="22"/>
+          <w:szCs w:val="22"/>
+        </w:rPr>
+        <w:t xml:space="preserve">страна (выберите Турцию; если выбора нет, регион сменим в шаге 3), имя и фамилия (любые), дата рождения (старше 18 лет), условия Apple и способ оплаты — «Нет».</w:t>
       </w:r>
     </w:p>
     <w:p>
@@ -657,15 +667,15 @@
           <w:sz w:val="22"/>
           <w:szCs w:val="22"/>
         </w:rPr>
-        <w:t xml:space="preserve">Способ оплаты. </w:t>
-      </w:r>
-      <w:r>
-        <w:rPr>
-          <w:rFonts w:ascii="Arial" w:cs="Arial" w:eastAsia="Arial" w:hAnsi="Arial"/>
-          <w:sz w:val="22"/>
-          <w:szCs w:val="22"/>
-        </w:rPr>
-        <w:t xml:space="preserve">Выберите «Нет».</w:t>
+        <w:t xml:space="preserve">4. Номер телефона. </w:t>
+      </w:r>
+      <w:r>
+        <w:rPr>
+          <w:rFonts w:ascii="Arial" w:cs="Arial" w:eastAsia="Arial" w:hAnsi="Arial"/>
+          <w:sz w:val="22"/>
+          <w:szCs w:val="22"/>
+        </w:rPr>
+        <w:t xml:space="preserve">Подойдёт российский (+7). Способ подтверждения: текстовое сообщение или звонок.</w:t>
       </w:r>
     </w:p>
     <w:p>
@@ -685,15 +695,15 @@
           <w:sz w:val="22"/>
           <w:szCs w:val="22"/>
         </w:rPr>
-        <w:t xml:space="preserve">Подтверждение почты. </w:t>
-      </w:r>
-      <w:r>
-        <w:rPr>
-          <w:rFonts w:ascii="Arial" w:cs="Arial" w:eastAsia="Arial" w:hAnsi="Arial"/>
-          <w:sz w:val="22"/>
-          <w:szCs w:val="22"/>
-        </w:rPr>
-        <w:t xml:space="preserve">Apple отправит код на указанный адрес — введите его.</w:t>
+        <w:t xml:space="preserve">5. Код. </w:t>
+      </w:r>
+      <w:r>
+        <w:rPr>
+          <w:rFonts w:ascii="Arial" w:cs="Arial" w:eastAsia="Arial" w:hAnsi="Arial"/>
+          <w:sz w:val="22"/>
+          <w:szCs w:val="22"/>
+        </w:rPr>
+        <w:t xml:space="preserve">Введите код подтверждения, отправленный на этот номер.</w:t>
       </w:r>
     </w:p>
     <w:p>
@@ -713,15 +723,15 @@
           <w:sz w:val="22"/>
           <w:szCs w:val="22"/>
         </w:rPr>
-        <w:t xml:space="preserve">Подтверждение телефона. </w:t>
-      </w:r>
-      <w:r>
-        <w:rPr>
-          <w:rFonts w:ascii="Arial" w:cs="Arial" w:eastAsia="Arial" w:hAnsi="Arial"/>
-          <w:sz w:val="22"/>
-          <w:szCs w:val="22"/>
-        </w:rPr>
-        <w:t xml:space="preserve">Введите номер (подойдёт российский) и код из SMS.</w:t>
+        <w:t xml:space="preserve">Подтверждение почты. </w:t>
+      </w:r>
+      <w:r>
+        <w:rPr>
+          <w:rFonts w:ascii="Arial" w:cs="Arial" w:eastAsia="Arial" w:hAnsi="Arial"/>
+          <w:sz w:val="22"/>
+          <w:szCs w:val="22"/>
+        </w:rPr>
+        <w:t xml:space="preserve">Apple отправит код на указанный e-mail — введите его в App Store.</w:t>
       </w:r>
     </w:p>
     <w:tbl>
@@ -859,6 +869,68 @@
         </w:tc>
       </w:tr>
     </w:tbl>
+    <w:p>
+      <w:pPr>
+        <w:keepNext/>
+        <w:spacing w:after="40" w:before="60"/>
+        <w:jc w:val="center"/>
+      </w:pPr>
+      <w:r>
+        <w:drawing>
+          <wp:inline distT="0" distB="0" distL="0" distR="0">
+            <wp:extent cx="6096000" cy="3048000"/>
+            <wp:effectExtent t="0" r="0" b="0" l="0"/>
+            <wp:docPr id="1" name="e1-email-flow" descr="2. E-mail → 3. Пароль → 4. Номер телефона → 5. Код из SMS" title="2. E-mail → 3. Пароль → 4. Номер телефона → 5. Код из SMS"/>
+            <wp:cNvGraphicFramePr>
+              <a:graphicFrameLocks xmlns:a="http://schemas.openxmlformats.org/drawingml/2006/main" noChangeAspect="1"/>
+            </wp:cNvGraphicFramePr>
+            <a:graphic xmlns:a="http://schemas.openxmlformats.org/drawingml/2006/main">
+              <a:graphicData uri="http://schemas.openxmlformats.org/drawingml/2006/picture">
+                <pic:pic xmlns:pic="http://schemas.openxmlformats.org/drawingml/2006/picture">
+                  <pic:nvPicPr>
+                    <pic:cNvPr id="0" name="" descr=""/>
+                    <pic:cNvPicPr>
+                      <a:picLocks noChangeAspect="1" noChangeArrowheads="1"/>
+                    </pic:cNvPicPr>
+                  </pic:nvPicPr>
+                  <pic:blipFill>
+                    <a:blip r:embed="rId11" cstate="none"/>
+                    <a:srcRect/>
+                    <a:stretch>
+                      <a:fillRect/>
+                    </a:stretch>
+                  </pic:blipFill>
+                  <pic:spPr bwMode="auto">
+                    <a:xfrm>
+                      <a:off x="0" y="0"/>
+                      <a:ext cx="6096000" cy="3048000"/>
+                    </a:xfrm>
+                    <a:prstGeom prst="rect">
+                      <a:avLst/>
+                    </a:prstGeom>
+                  </pic:spPr>
+                </pic:pic>
+              </a:graphicData>
+            </a:graphic>
+          </wp:inline>
+        </w:drawing>
+      </w:r>
+    </w:p>
+    <w:p>
+      <w:pPr>
+        <w:spacing w:after="120"/>
+        <w:jc w:val="center"/>
+      </w:pPr>
+      <w:r>
+        <w:rPr>
+          <w:rFonts w:ascii="Arial" w:cs="Arial" w:eastAsia="Arial" w:hAnsi="Arial"/>
+          <w:color w:val="5F6B66"/>
+          <w:sz w:val="18"/>
+          <w:szCs w:val="18"/>
+        </w:rPr>
+        <w:t xml:space="preserve">2. E-mail → 3. Пароль → 4. Номер телефона → 5. Код из SMS</w:t>
+      </w:r>
+    </w:p>
     <w:tbl>
       <w:tblPr>
         <w:tblW w:type="dxa" w:w="10206"/>
@@ -963,7 +1035,7 @@
         <w:pStyle w:val="ListParagraph"/>
         <w:numPr>
           <w:ilvl w:val="0"/>
-          <w:numId w:val="3"/>
+          <w:numId w:val="2"/>
         </w:numPr>
         <w:spacing w:after="80" w:line="290"/>
       </w:pPr>
@@ -991,7 +1063,7 @@
         <w:pStyle w:val="ListParagraph"/>
         <w:numPr>
           <w:ilvl w:val="0"/>
-          <w:numId w:val="3"/>
+          <w:numId w:val="2"/>
         </w:numPr>
         <w:spacing w:after="80" w:line="290"/>
       </w:pPr>
@@ -1019,7 +1091,7 @@
         <w:pStyle w:val="ListParagraph"/>
         <w:numPr>
           <w:ilvl w:val="0"/>
-          <w:numId w:val="3"/>
+          <w:numId w:val="2"/>
         </w:numPr>
         <w:spacing w:after="80" w:line="290"/>
       </w:pPr>
@@ -1047,7 +1119,7 @@
         <w:pStyle w:val="ListParagraph"/>
         <w:numPr>
           <w:ilvl w:val="0"/>
-          <w:numId w:val="3"/>
+          <w:numId w:val="2"/>
         </w:numPr>
         <w:spacing w:after="80" w:line="290"/>
       </w:pPr>
@@ -1075,7 +1147,7 @@
         <w:pStyle w:val="ListParagraph"/>
         <w:numPr>
           <w:ilvl w:val="0"/>
-          <w:numId w:val="3"/>
+          <w:numId w:val="2"/>
         </w:numPr>
         <w:spacing w:after="80" w:line="290"/>
       </w:pPr>
@@ -1103,7 +1175,7 @@
         <w:pStyle w:val="ListParagraph"/>
         <w:numPr>
           <w:ilvl w:val="0"/>
-          <w:numId w:val="3"/>
+          <w:numId w:val="2"/>
         </w:numPr>
         <w:spacing w:after="80" w:line="290"/>
       </w:pPr>
@@ -1138,68 +1210,6 @@
             <wp:extent cx="5715000" cy="3571875"/>
             <wp:effectExtent t="0" r="0" b="0" l="0"/>
             <wp:docPr id="1" name="a1-appstore-profile" descr="1. Иконка App Store → 2. Профиль → 3. Имя аккаунта" title="1. Иконка App Store → 2. Профиль → 3. Имя аккаунта"/>
-            <wp:cNvGraphicFramePr>
-              <a:graphicFrameLocks xmlns:a="http://schemas.openxmlformats.org/drawingml/2006/main" noChangeAspect="1"/>
-            </wp:cNvGraphicFramePr>
-            <a:graphic xmlns:a="http://schemas.openxmlformats.org/drawingml/2006/main">
-              <a:graphicData uri="http://schemas.openxmlformats.org/drawingml/2006/picture">
-                <pic:pic xmlns:pic="http://schemas.openxmlformats.org/drawingml/2006/picture">
-                  <pic:nvPicPr>
-                    <pic:cNvPr id="0" name="" descr=""/>
-                    <pic:cNvPicPr>
-                      <a:picLocks noChangeAspect="1" noChangeArrowheads="1"/>
-                    </pic:cNvPicPr>
-                  </pic:nvPicPr>
-                  <pic:blipFill>
-                    <a:blip r:embed="rId11" cstate="none"/>
-                    <a:srcRect/>
-                    <a:stretch>
-                      <a:fillRect/>
-                    </a:stretch>
-                  </pic:blipFill>
-                  <pic:spPr bwMode="auto">
-                    <a:xfrm>
-                      <a:off x="0" y="0"/>
-                      <a:ext cx="5715000" cy="3571875"/>
-                    </a:xfrm>
-                    <a:prstGeom prst="rect">
-                      <a:avLst/>
-                    </a:prstGeom>
-                  </pic:spPr>
-                </pic:pic>
-              </a:graphicData>
-            </a:graphic>
-          </wp:inline>
-        </w:drawing>
-      </w:r>
-    </w:p>
-    <w:p>
-      <w:pPr>
-        <w:spacing w:after="120"/>
-        <w:jc w:val="center"/>
-      </w:pPr>
-      <w:r>
-        <w:rPr>
-          <w:rFonts w:ascii="Arial" w:cs="Arial" w:eastAsia="Arial" w:hAnsi="Arial"/>
-          <w:color w:val="5F6B66"/>
-          <w:sz w:val="18"/>
-          <w:szCs w:val="18"/>
-        </w:rPr>
-        <w:t xml:space="preserve">1. Иконка App Store → 2. Профиль → 3. Имя аккаунта</w:t>
-      </w:r>
-    </w:p>
-    <w:p>
-      <w:pPr>
-        <w:keepNext/>
-        <w:spacing w:after="40" w:before="60"/>
-        <w:jc w:val="center"/>
-      </w:pPr>
-      <w:r>
-        <w:drawing>
-          <wp:inline distT="0" distB="0" distL="0" distR="0">
-            <wp:extent cx="5715000" cy="3562350"/>
-            <wp:effectExtent t="0" r="0" b="0" l="0"/>
-            <wp:docPr id="1" name="a2-region-turkey" descr="4. «Страна/регион» → 5. Поиск → 6. «Турция»" title="4. «Страна/регион» → 5. Поиск → 6. «Турция»"/>
             <wp:cNvGraphicFramePr>
               <a:graphicFrameLocks xmlns:a="http://schemas.openxmlformats.org/drawingml/2006/main" noChangeAspect="1"/>
             </wp:cNvGraphicFramePr>
@@ -1222,7 +1232,7 @@
                   <pic:spPr bwMode="auto">
                     <a:xfrm>
                       <a:off x="0" y="0"/>
-                      <a:ext cx="5715000" cy="3562350"/>
+                      <a:ext cx="5715000" cy="3571875"/>
                     </a:xfrm>
                     <a:prstGeom prst="rect">
                       <a:avLst/>
@@ -1247,7 +1257,7 @@
           <w:sz w:val="18"/>
           <w:szCs w:val="18"/>
         </w:rPr>
-        <w:t xml:space="preserve">4. «Страна/регион» → 5. Поиск → 6. «Турция»</w:t>
+        <w:t xml:space="preserve">1. Иконка App Store → 2. Профиль → 3. Имя аккаунта</w:t>
       </w:r>
     </w:p>
     <w:p>
@@ -1259,9 +1269,9 @@
       <w:r>
         <w:drawing>
           <wp:inline distT="0" distB="0" distL="0" distR="0">
-            <wp:extent cx="5715000" cy="3467100"/>
+            <wp:extent cx="5715000" cy="3562350"/>
             <wp:effectExtent t="0" r="0" b="0" l="0"/>
-            <wp:docPr id="1" name="a3-terms-payment" descr="7. «Продолжить» → 8. «Принять» → 9. Способ оплаты: «Нет»" title="7. «Продолжить» → 8. «Принять» → 9. Способ оплаты: «Нет»"/>
+            <wp:docPr id="1" name="a2-region-turkey" descr="4. «Страна/регион» → 5. Поиск → 6. «Турция»" title="4. «Страна/регион» → 5. Поиск → 6. «Турция»"/>
             <wp:cNvGraphicFramePr>
               <a:graphicFrameLocks xmlns:a="http://schemas.openxmlformats.org/drawingml/2006/main" noChangeAspect="1"/>
             </wp:cNvGraphicFramePr>
@@ -1284,6 +1294,68 @@
                   <pic:spPr bwMode="auto">
                     <a:xfrm>
                       <a:off x="0" y="0"/>
+                      <a:ext cx="5715000" cy="3562350"/>
+                    </a:xfrm>
+                    <a:prstGeom prst="rect">
+                      <a:avLst/>
+                    </a:prstGeom>
+                  </pic:spPr>
+                </pic:pic>
+              </a:graphicData>
+            </a:graphic>
+          </wp:inline>
+        </w:drawing>
+      </w:r>
+    </w:p>
+    <w:p>
+      <w:pPr>
+        <w:spacing w:after="120"/>
+        <w:jc w:val="center"/>
+      </w:pPr>
+      <w:r>
+        <w:rPr>
+          <w:rFonts w:ascii="Arial" w:cs="Arial" w:eastAsia="Arial" w:hAnsi="Arial"/>
+          <w:color w:val="5F6B66"/>
+          <w:sz w:val="18"/>
+          <w:szCs w:val="18"/>
+        </w:rPr>
+        <w:t xml:space="preserve">4. «Страна/регион» → 5. Поиск → 6. «Турция»</w:t>
+      </w:r>
+    </w:p>
+    <w:p>
+      <w:pPr>
+        <w:keepNext/>
+        <w:spacing w:after="40" w:before="60"/>
+        <w:jc w:val="center"/>
+      </w:pPr>
+      <w:r>
+        <w:drawing>
+          <wp:inline distT="0" distB="0" distL="0" distR="0">
+            <wp:extent cx="5715000" cy="3467100"/>
+            <wp:effectExtent t="0" r="0" b="0" l="0"/>
+            <wp:docPr id="1" name="a3-terms-payment" descr="7. «Продолжить» → 8. «Принять» → 9. Способ оплаты: «Нет»" title="7. «Продолжить» → 8. «Принять» → 9. Способ оплаты: «Нет»"/>
+            <wp:cNvGraphicFramePr>
+              <a:graphicFrameLocks xmlns:a="http://schemas.openxmlformats.org/drawingml/2006/main" noChangeAspect="1"/>
+            </wp:cNvGraphicFramePr>
+            <a:graphic xmlns:a="http://schemas.openxmlformats.org/drawingml/2006/main">
+              <a:graphicData uri="http://schemas.openxmlformats.org/drawingml/2006/picture">
+                <pic:pic xmlns:pic="http://schemas.openxmlformats.org/drawingml/2006/picture">
+                  <pic:nvPicPr>
+                    <pic:cNvPr id="0" name="" descr=""/>
+                    <pic:cNvPicPr>
+                      <a:picLocks noChangeAspect="1" noChangeArrowheads="1"/>
+                    </pic:cNvPicPr>
+                  </pic:nvPicPr>
+                  <pic:blipFill>
+                    <a:blip r:embed="rId14" cstate="none"/>
+                    <a:srcRect/>
+                    <a:stretch>
+                      <a:fillRect/>
+                    </a:stretch>
+                  </pic:blipFill>
+                  <pic:spPr bwMode="auto">
+                    <a:xfrm>
+                      <a:off x="0" y="0"/>
                       <a:ext cx="5715000" cy="3467100"/>
                     </a:xfrm>
                     <a:prstGeom prst="rect">
@@ -1337,7 +1409,7 @@
                     </pic:cNvPicPr>
                   </pic:nvPicPr>
                   <pic:blipFill>
-                    <a:blip r:embed="rId14" cstate="none"/>
+                    <a:blip r:embed="rId15" cstate="none"/>
                     <a:srcRect/>
                     <a:stretch>
                       <a:fillRect/>
@@ -1583,85 +1655,6 @@
                           </pic:cNvPicPr>
                         </pic:nvPicPr>
                         <pic:blipFill>
-                          <a:blip r:embed="rId15" cstate="none"/>
-                          <a:srcRect/>
-                          <a:stretch>
-                            <a:fillRect/>
-                          </a:stretch>
-                        </pic:blipFill>
-                        <pic:spPr bwMode="auto">
-                          <a:xfrm>
-                            <a:off x="0" y="0"/>
-                            <a:ext cx="1638300" cy="3209925"/>
-                          </a:xfrm>
-                          <a:prstGeom prst="rect">
-                            <a:avLst/>
-                          </a:prstGeom>
-                        </pic:spPr>
-                      </pic:pic>
-                    </a:graphicData>
-                  </a:graphic>
-                </wp:inline>
-              </w:drawing>
-            </w:r>
-          </w:p>
-          <w:p>
-            <w:pPr>
-              <w:spacing w:after="80"/>
-              <w:jc w:val="center"/>
-            </w:pPr>
-            <w:r>
-              <w:rPr>
-                <w:rFonts w:ascii="Arial" w:cs="Arial" w:eastAsia="Arial" w:hAnsi="Arial"/>
-                <w:color w:val="5F6B66"/>
-                <w:sz w:val="18"/>
-                <w:szCs w:val="18"/>
-              </w:rPr>
-              <w:t xml:space="preserve">1. Apple</w:t>
-            </w:r>
-          </w:p>
-        </w:tc>
-        <w:tc>
-          <w:tcPr>
-            <w:tcW w:type="dxa" w:w="3402"/>
-            <w:tcBorders>
-              <w:top w:val="none" w:color="FFFFFF" w:sz="0"/>
-              <w:left w:val="none" w:color="FFFFFF" w:sz="0"/>
-              <w:bottom w:val="none" w:color="FFFFFF" w:sz="0"/>
-              <w:right w:val="none" w:color="FFFFFF" w:sz="0"/>
-            </w:tcBorders>
-            <w:tcMar>
-              <w:top w:type="dxa" w:w="40"/>
-              <w:left w:type="dxa" w:w="40"/>
-              <w:bottom w:type="dxa" w:w="40"/>
-              <w:right w:type="dxa" w:w="40"/>
-            </w:tcMar>
-          </w:tcPr>
-          <w:p>
-            <w:pPr>
-              <w:keepNext/>
-              <w:spacing w:after="60"/>
-              <w:jc w:val="center"/>
-            </w:pPr>
-            <w:r>
-              <w:drawing>
-                <wp:inline distT="0" distB="0" distL="0" distR="0">
-                  <wp:extent cx="1638300" cy="3209925"/>
-                  <wp:effectExtent t="0" r="0" b="0" l="0"/>
-                  <wp:docPr id="1" name="03-turkey-cards" descr="2. «+» у номинала" title="2. «+» у номинала"/>
-                  <wp:cNvGraphicFramePr>
-                    <a:graphicFrameLocks xmlns:a="http://schemas.openxmlformats.org/drawingml/2006/main" noChangeAspect="1"/>
-                  </wp:cNvGraphicFramePr>
-                  <a:graphic xmlns:a="http://schemas.openxmlformats.org/drawingml/2006/main">
-                    <a:graphicData uri="http://schemas.openxmlformats.org/drawingml/2006/picture">
-                      <pic:pic xmlns:pic="http://schemas.openxmlformats.org/drawingml/2006/picture">
-                        <pic:nvPicPr>
-                          <pic:cNvPr id="0" name="" descr=""/>
-                          <pic:cNvPicPr>
-                            <a:picLocks noChangeAspect="1" noChangeArrowheads="1"/>
-                          </pic:cNvPicPr>
-                        </pic:nvPicPr>
-                        <pic:blipFill>
                           <a:blip r:embed="rId16" cstate="none"/>
                           <a:srcRect/>
                           <a:stretch>
@@ -1696,7 +1689,7 @@
                 <w:sz w:val="18"/>
                 <w:szCs w:val="18"/>
               </w:rPr>
-              <w:t xml:space="preserve">2. «+» у номинала</w:t>
+              <w:t xml:space="preserve">1. Apple</w:t>
             </w:r>
           </w:p>
         </w:tc>
@@ -1727,7 +1720,7 @@
                 <wp:inline distT="0" distB="0" distL="0" distR="0">
                   <wp:extent cx="1638300" cy="3209925"/>
                   <wp:effectExtent t="0" r="0" b="0" l="0"/>
-                  <wp:docPr id="1" name="06-added-to-cart" descr="3. «Перейти в корзину»" title="3. «Перейти в корзину»"/>
+                  <wp:docPr id="1" name="03-turkey-cards" descr="2. «+» у номинала" title="2. «+» у номинала"/>
                   <wp:cNvGraphicFramePr>
                     <a:graphicFrameLocks xmlns:a="http://schemas.openxmlformats.org/drawingml/2006/main" noChangeAspect="1"/>
                   </wp:cNvGraphicFramePr>
@@ -1775,6 +1768,85 @@
                 <w:sz w:val="18"/>
                 <w:szCs w:val="18"/>
               </w:rPr>
+              <w:t xml:space="preserve">2. «+» у номинала</w:t>
+            </w:r>
+          </w:p>
+        </w:tc>
+        <w:tc>
+          <w:tcPr>
+            <w:tcW w:type="dxa" w:w="3402"/>
+            <w:tcBorders>
+              <w:top w:val="none" w:color="FFFFFF" w:sz="0"/>
+              <w:left w:val="none" w:color="FFFFFF" w:sz="0"/>
+              <w:bottom w:val="none" w:color="FFFFFF" w:sz="0"/>
+              <w:right w:val="none" w:color="FFFFFF" w:sz="0"/>
+            </w:tcBorders>
+            <w:tcMar>
+              <w:top w:type="dxa" w:w="40"/>
+              <w:left w:type="dxa" w:w="40"/>
+              <w:bottom w:type="dxa" w:w="40"/>
+              <w:right w:type="dxa" w:w="40"/>
+            </w:tcMar>
+          </w:tcPr>
+          <w:p>
+            <w:pPr>
+              <w:keepNext/>
+              <w:spacing w:after="60"/>
+              <w:jc w:val="center"/>
+            </w:pPr>
+            <w:r>
+              <w:drawing>
+                <wp:inline distT="0" distB="0" distL="0" distR="0">
+                  <wp:extent cx="1638300" cy="3209925"/>
+                  <wp:effectExtent t="0" r="0" b="0" l="0"/>
+                  <wp:docPr id="1" name="06-added-to-cart" descr="3. «Перейти в корзину»" title="3. «Перейти в корзину»"/>
+                  <wp:cNvGraphicFramePr>
+                    <a:graphicFrameLocks xmlns:a="http://schemas.openxmlformats.org/drawingml/2006/main" noChangeAspect="1"/>
+                  </wp:cNvGraphicFramePr>
+                  <a:graphic xmlns:a="http://schemas.openxmlformats.org/drawingml/2006/main">
+                    <a:graphicData uri="http://schemas.openxmlformats.org/drawingml/2006/picture">
+                      <pic:pic xmlns:pic="http://schemas.openxmlformats.org/drawingml/2006/picture">
+                        <pic:nvPicPr>
+                          <pic:cNvPr id="0" name="" descr=""/>
+                          <pic:cNvPicPr>
+                            <a:picLocks noChangeAspect="1" noChangeArrowheads="1"/>
+                          </pic:cNvPicPr>
+                        </pic:nvPicPr>
+                        <pic:blipFill>
+                          <a:blip r:embed="rId18" cstate="none"/>
+                          <a:srcRect/>
+                          <a:stretch>
+                            <a:fillRect/>
+                          </a:stretch>
+                        </pic:blipFill>
+                        <pic:spPr bwMode="auto">
+                          <a:xfrm>
+                            <a:off x="0" y="0"/>
+                            <a:ext cx="1638300" cy="3209925"/>
+                          </a:xfrm>
+                          <a:prstGeom prst="rect">
+                            <a:avLst/>
+                          </a:prstGeom>
+                        </pic:spPr>
+                      </pic:pic>
+                    </a:graphicData>
+                  </a:graphic>
+                </wp:inline>
+              </w:drawing>
+            </w:r>
+          </w:p>
+          <w:p>
+            <w:pPr>
+              <w:spacing w:after="80"/>
+              <w:jc w:val="center"/>
+            </w:pPr>
+            <w:r>
+              <w:rPr>
+                <w:rFonts w:ascii="Arial" w:cs="Arial" w:eastAsia="Arial" w:hAnsi="Arial"/>
+                <w:color w:val="5F6B66"/>
+                <w:sz w:val="18"/>
+                <w:szCs w:val="18"/>
+              </w:rPr>
               <w:t xml:space="preserve">3. «Перейти в корзину»</w:t>
             </w:r>
           </w:p>
@@ -1841,7 +1913,7 @@
         <w:pStyle w:val="ListParagraph"/>
         <w:numPr>
           <w:ilvl w:val="0"/>
-          <w:numId w:val="3"/>
+          <w:numId w:val="2"/>
         </w:numPr>
         <w:spacing w:after="80" w:line="290"/>
       </w:pPr>
@@ -1887,7 +1959,7 @@
         <w:pStyle w:val="ListParagraph"/>
         <w:numPr>
           <w:ilvl w:val="0"/>
-          <w:numId w:val="3"/>
+          <w:numId w:val="2"/>
         </w:numPr>
         <w:spacing w:after="80" w:line="290"/>
       </w:pPr>
@@ -1933,7 +2005,7 @@
         <w:pStyle w:val="ListParagraph"/>
         <w:numPr>
           <w:ilvl w:val="0"/>
-          <w:numId w:val="3"/>
+          <w:numId w:val="2"/>
         </w:numPr>
         <w:spacing w:after="80" w:line="290"/>
       </w:pPr>
@@ -1979,7 +2051,7 @@
         <w:pStyle w:val="ListParagraph"/>
         <w:numPr>
           <w:ilvl w:val="0"/>
-          <w:numId w:val="3"/>
+          <w:numId w:val="2"/>
         </w:numPr>
         <w:spacing w:after="80" w:line="290"/>
       </w:pPr>
@@ -2007,7 +2079,7 @@
         <w:pStyle w:val="ListParagraph"/>
         <w:numPr>
           <w:ilvl w:val="0"/>
-          <w:numId w:val="3"/>
+          <w:numId w:val="2"/>
         </w:numPr>
         <w:spacing w:after="80" w:line="290"/>
       </w:pPr>
@@ -2093,85 +2165,6 @@
                           </pic:cNvPicPr>
                         </pic:nvPicPr>
                         <pic:blipFill>
-                          <a:blip r:embed="rId18" cstate="none"/>
-                          <a:srcRect/>
-                          <a:stretch>
-                            <a:fillRect/>
-                          </a:stretch>
-                        </pic:blipFill>
-                        <pic:spPr bwMode="auto">
-                          <a:xfrm>
-                            <a:off x="0" y="0"/>
-                            <a:ext cx="1638300" cy="3209925"/>
-                          </a:xfrm>
-                          <a:prstGeom prst="rect">
-                            <a:avLst/>
-                          </a:prstGeom>
-                        </pic:spPr>
-                      </pic:pic>
-                    </a:graphicData>
-                  </a:graphic>
-                </wp:inline>
-              </w:drawing>
-            </w:r>
-          </w:p>
-          <w:p>
-            <w:pPr>
-              <w:spacing w:after="80"/>
-              <w:jc w:val="center"/>
-            </w:pPr>
-            <w:r>
-              <w:rPr>
-                <w:rFonts w:ascii="Arial" w:cs="Arial" w:eastAsia="Arial" w:hAnsi="Arial"/>
-                <w:color w:val="5F6B66"/>
-                <w:sz w:val="18"/>
-                <w:szCs w:val="18"/>
-              </w:rPr>
-              <w:t xml:space="preserve">1. Галочка</w:t>
-            </w:r>
-          </w:p>
-        </w:tc>
-        <w:tc>
-          <w:tcPr>
-            <w:tcW w:type="dxa" w:w="3402"/>
-            <w:tcBorders>
-              <w:top w:val="none" w:color="FFFFFF" w:sz="0"/>
-              <w:left w:val="none" w:color="FFFFFF" w:sz="0"/>
-              <w:bottom w:val="none" w:color="FFFFFF" w:sz="0"/>
-              <w:right w:val="none" w:color="FFFFFF" w:sz="0"/>
-            </w:tcBorders>
-            <w:tcMar>
-              <w:top w:type="dxa" w:w="40"/>
-              <w:left w:type="dxa" w:w="40"/>
-              <w:bottom w:type="dxa" w:w="40"/>
-              <w:right w:type="dxa" w:w="40"/>
-            </w:tcMar>
-          </w:tcPr>
-          <w:p>
-            <w:pPr>
-              <w:keepNext/>
-              <w:spacing w:after="60"/>
-              <w:jc w:val="center"/>
-            </w:pPr>
-            <w:r>
-              <w:drawing>
-                <wp:inline distT="0" distB="0" distL="0" distR="0">
-                  <wp:extent cx="1638300" cy="3209925"/>
-                  <wp:effectExtent t="0" r="0" b="0" l="0"/>
-                  <wp:docPr id="1" name="07b-cart-pay" descr="2. «Оплатить»" title="2. «Оплатить»"/>
-                  <wp:cNvGraphicFramePr>
-                    <a:graphicFrameLocks xmlns:a="http://schemas.openxmlformats.org/drawingml/2006/main" noChangeAspect="1"/>
-                  </wp:cNvGraphicFramePr>
-                  <a:graphic xmlns:a="http://schemas.openxmlformats.org/drawingml/2006/main">
-                    <a:graphicData uri="http://schemas.openxmlformats.org/drawingml/2006/picture">
-                      <pic:pic xmlns:pic="http://schemas.openxmlformats.org/drawingml/2006/picture">
-                        <pic:nvPicPr>
-                          <pic:cNvPr id="0" name="" descr=""/>
-                          <pic:cNvPicPr>
-                            <a:picLocks noChangeAspect="1" noChangeArrowheads="1"/>
-                          </pic:cNvPicPr>
-                        </pic:nvPicPr>
-                        <pic:blipFill>
                           <a:blip r:embed="rId19" cstate="none"/>
                           <a:srcRect/>
                           <a:stretch>
@@ -2206,6 +2199,85 @@
                 <w:sz w:val="18"/>
                 <w:szCs w:val="18"/>
               </w:rPr>
+              <w:t xml:space="preserve">1. Галочка</w:t>
+            </w:r>
+          </w:p>
+        </w:tc>
+        <w:tc>
+          <w:tcPr>
+            <w:tcW w:type="dxa" w:w="3402"/>
+            <w:tcBorders>
+              <w:top w:val="none" w:color="FFFFFF" w:sz="0"/>
+              <w:left w:val="none" w:color="FFFFFF" w:sz="0"/>
+              <w:bottom w:val="none" w:color="FFFFFF" w:sz="0"/>
+              <w:right w:val="none" w:color="FFFFFF" w:sz="0"/>
+            </w:tcBorders>
+            <w:tcMar>
+              <w:top w:type="dxa" w:w="40"/>
+              <w:left w:type="dxa" w:w="40"/>
+              <w:bottom w:type="dxa" w:w="40"/>
+              <w:right w:type="dxa" w:w="40"/>
+            </w:tcMar>
+          </w:tcPr>
+          <w:p>
+            <w:pPr>
+              <w:keepNext/>
+              <w:spacing w:after="60"/>
+              <w:jc w:val="center"/>
+            </w:pPr>
+            <w:r>
+              <w:drawing>
+                <wp:inline distT="0" distB="0" distL="0" distR="0">
+                  <wp:extent cx="1638300" cy="3209925"/>
+                  <wp:effectExtent t="0" r="0" b="0" l="0"/>
+                  <wp:docPr id="1" name="07b-cart-pay" descr="2. «Оплатить»" title="2. «Оплатить»"/>
+                  <wp:cNvGraphicFramePr>
+                    <a:graphicFrameLocks xmlns:a="http://schemas.openxmlformats.org/drawingml/2006/main" noChangeAspect="1"/>
+                  </wp:cNvGraphicFramePr>
+                  <a:graphic xmlns:a="http://schemas.openxmlformats.org/drawingml/2006/main">
+                    <a:graphicData uri="http://schemas.openxmlformats.org/drawingml/2006/picture">
+                      <pic:pic xmlns:pic="http://schemas.openxmlformats.org/drawingml/2006/picture">
+                        <pic:nvPicPr>
+                          <pic:cNvPr id="0" name="" descr=""/>
+                          <pic:cNvPicPr>
+                            <a:picLocks noChangeAspect="1" noChangeArrowheads="1"/>
+                          </pic:cNvPicPr>
+                        </pic:nvPicPr>
+                        <pic:blipFill>
+                          <a:blip r:embed="rId20" cstate="none"/>
+                          <a:srcRect/>
+                          <a:stretch>
+                            <a:fillRect/>
+                          </a:stretch>
+                        </pic:blipFill>
+                        <pic:spPr bwMode="auto">
+                          <a:xfrm>
+                            <a:off x="0" y="0"/>
+                            <a:ext cx="1638300" cy="3209925"/>
+                          </a:xfrm>
+                          <a:prstGeom prst="rect">
+                            <a:avLst/>
+                          </a:prstGeom>
+                        </pic:spPr>
+                      </pic:pic>
+                    </a:graphicData>
+                  </a:graphic>
+                </wp:inline>
+              </w:drawing>
+            </w:r>
+          </w:p>
+          <w:p>
+            <w:pPr>
+              <w:spacing w:after="80"/>
+              <w:jc w:val="center"/>
+            </w:pPr>
+            <w:r>
+              <w:rPr>
+                <w:rFonts w:ascii="Arial" w:cs="Arial" w:eastAsia="Arial" w:hAnsi="Arial"/>
+                <w:color w:val="5F6B66"/>
+                <w:sz w:val="18"/>
+                <w:szCs w:val="18"/>
+              </w:rPr>
               <w:t xml:space="preserve">2. «Оплатить»</w:t>
             </w:r>
           </w:p>
@@ -2251,7 +2323,7 @@
                           </pic:cNvPicPr>
                         </pic:nvPicPr>
                         <pic:blipFill>
-                          <a:blip r:embed="rId20" cstate="none"/>
+                          <a:blip r:embed="rId21" cstate="none"/>
                           <a:srcRect/>
                           <a:stretch>
                             <a:fillRect/>
@@ -2354,85 +2426,6 @@
                           </pic:cNvPicPr>
                         </pic:nvPicPr>
                         <pic:blipFill>
-                          <a:blip r:embed="rId21" cstate="none"/>
-                          <a:srcRect/>
-                          <a:stretch>
-                            <a:fillRect/>
-                          </a:stretch>
-                        </pic:blipFill>
-                        <pic:spPr bwMode="auto">
-                          <a:xfrm>
-                            <a:off x="0" y="0"/>
-                            <a:ext cx="1638300" cy="3209925"/>
-                          </a:xfrm>
-                          <a:prstGeom prst="rect">
-                            <a:avLst/>
-                          </a:prstGeom>
-                        </pic:spPr>
-                      </pic:pic>
-                    </a:graphicData>
-                  </a:graphic>
-                </wp:inline>
-              </w:drawing>
-            </w:r>
-          </w:p>
-          <w:p>
-            <w:pPr>
-              <w:spacing w:after="80"/>
-              <w:jc w:val="center"/>
-            </w:pPr>
-            <w:r>
-              <w:rPr>
-                <w:rFonts w:ascii="Arial" w:cs="Arial" w:eastAsia="Arial" w:hAnsi="Arial"/>
-                <w:color w:val="5F6B66"/>
-                <w:sz w:val="18"/>
-                <w:szCs w:val="18"/>
-              </w:rPr>
-              <w:t xml:space="preserve">4. Отключите VPN → «Ок»</w:t>
-            </w:r>
-          </w:p>
-        </w:tc>
-        <w:tc>
-          <w:tcPr>
-            <w:tcW w:type="dxa" w:w="3402"/>
-            <w:tcBorders>
-              <w:top w:val="none" w:color="FFFFFF" w:sz="0"/>
-              <w:left w:val="none" w:color="FFFFFF" w:sz="0"/>
-              <w:bottom w:val="none" w:color="FFFFFF" w:sz="0"/>
-              <w:right w:val="none" w:color="FFFFFF" w:sz="0"/>
-            </w:tcBorders>
-            <w:tcMar>
-              <w:top w:type="dxa" w:w="40"/>
-              <w:left w:type="dxa" w:w="40"/>
-              <w:bottom w:type="dxa" w:w="40"/>
-              <w:right w:type="dxa" w:w="40"/>
-            </w:tcMar>
-          </w:tcPr>
-          <w:p>
-            <w:pPr>
-              <w:keepNext/>
-              <w:spacing w:after="60"/>
-              <w:jc w:val="center"/>
-            </w:pPr>
-            <w:r>
-              <w:drawing>
-                <wp:inline distT="0" distB="0" distL="0" distR="0">
-                  <wp:extent cx="1638300" cy="3209925"/>
-                  <wp:effectExtent t="0" r="0" b="0" l="0"/>
-                  <wp:docPr id="1" name="10-payment-methods" descr="5. Способ оплаты" title="5. Способ оплаты"/>
-                  <wp:cNvGraphicFramePr>
-                    <a:graphicFrameLocks xmlns:a="http://schemas.openxmlformats.org/drawingml/2006/main" noChangeAspect="1"/>
-                  </wp:cNvGraphicFramePr>
-                  <a:graphic xmlns:a="http://schemas.openxmlformats.org/drawingml/2006/main">
-                    <a:graphicData uri="http://schemas.openxmlformats.org/drawingml/2006/picture">
-                      <pic:pic xmlns:pic="http://schemas.openxmlformats.org/drawingml/2006/picture">
-                        <pic:nvPicPr>
-                          <pic:cNvPr id="0" name="" descr=""/>
-                          <pic:cNvPicPr>
-                            <a:picLocks noChangeAspect="1" noChangeArrowheads="1"/>
-                          </pic:cNvPicPr>
-                        </pic:nvPicPr>
-                        <pic:blipFill>
                           <a:blip r:embed="rId22" cstate="none"/>
                           <a:srcRect/>
                           <a:stretch>
@@ -2467,6 +2460,85 @@
                 <w:sz w:val="18"/>
                 <w:szCs w:val="18"/>
               </w:rPr>
+              <w:t xml:space="preserve">4. Отключите VPN → «Ок»</w:t>
+            </w:r>
+          </w:p>
+        </w:tc>
+        <w:tc>
+          <w:tcPr>
+            <w:tcW w:type="dxa" w:w="3402"/>
+            <w:tcBorders>
+              <w:top w:val="none" w:color="FFFFFF" w:sz="0"/>
+              <w:left w:val="none" w:color="FFFFFF" w:sz="0"/>
+              <w:bottom w:val="none" w:color="FFFFFF" w:sz="0"/>
+              <w:right w:val="none" w:color="FFFFFF" w:sz="0"/>
+            </w:tcBorders>
+            <w:tcMar>
+              <w:top w:type="dxa" w:w="40"/>
+              <w:left w:type="dxa" w:w="40"/>
+              <w:bottom w:type="dxa" w:w="40"/>
+              <w:right w:type="dxa" w:w="40"/>
+            </w:tcMar>
+          </w:tcPr>
+          <w:p>
+            <w:pPr>
+              <w:keepNext/>
+              <w:spacing w:after="60"/>
+              <w:jc w:val="center"/>
+            </w:pPr>
+            <w:r>
+              <w:drawing>
+                <wp:inline distT="0" distB="0" distL="0" distR="0">
+                  <wp:extent cx="1638300" cy="3209925"/>
+                  <wp:effectExtent t="0" r="0" b="0" l="0"/>
+                  <wp:docPr id="1" name="10-payment-methods" descr="5. Способ оплаты" title="5. Способ оплаты"/>
+                  <wp:cNvGraphicFramePr>
+                    <a:graphicFrameLocks xmlns:a="http://schemas.openxmlformats.org/drawingml/2006/main" noChangeAspect="1"/>
+                  </wp:cNvGraphicFramePr>
+                  <a:graphic xmlns:a="http://schemas.openxmlformats.org/drawingml/2006/main">
+                    <a:graphicData uri="http://schemas.openxmlformats.org/drawingml/2006/picture">
+                      <pic:pic xmlns:pic="http://schemas.openxmlformats.org/drawingml/2006/picture">
+                        <pic:nvPicPr>
+                          <pic:cNvPr id="0" name="" descr=""/>
+                          <pic:cNvPicPr>
+                            <a:picLocks noChangeAspect="1" noChangeArrowheads="1"/>
+                          </pic:cNvPicPr>
+                        </pic:nvPicPr>
+                        <pic:blipFill>
+                          <a:blip r:embed="rId23" cstate="none"/>
+                          <a:srcRect/>
+                          <a:stretch>
+                            <a:fillRect/>
+                          </a:stretch>
+                        </pic:blipFill>
+                        <pic:spPr bwMode="auto">
+                          <a:xfrm>
+                            <a:off x="0" y="0"/>
+                            <a:ext cx="1638300" cy="3209925"/>
+                          </a:xfrm>
+                          <a:prstGeom prst="rect">
+                            <a:avLst/>
+                          </a:prstGeom>
+                        </pic:spPr>
+                      </pic:pic>
+                    </a:graphicData>
+                  </a:graphic>
+                </wp:inline>
+              </w:drawing>
+            </w:r>
+          </w:p>
+          <w:p>
+            <w:pPr>
+              <w:spacing w:after="80"/>
+              <w:jc w:val="center"/>
+            </w:pPr>
+            <w:r>
+              <w:rPr>
+                <w:rFonts w:ascii="Arial" w:cs="Arial" w:eastAsia="Arial" w:hAnsi="Arial"/>
+                <w:color w:val="5F6B66"/>
+                <w:sz w:val="18"/>
+                <w:szCs w:val="18"/>
+              </w:rPr>
               <w:t xml:space="preserve">5. Способ оплаты</w:t>
             </w:r>
           </w:p>
@@ -2512,7 +2584,7 @@
                           </pic:cNvPicPr>
                         </pic:nvPicPr>
                         <pic:blipFill>
-                          <a:blip r:embed="rId23" cstate="none"/>
+                          <a:blip r:embed="rId24" cstate="none"/>
                           <a:srcRect/>
                           <a:stretch>
                             <a:fillRect/>
@@ -2655,7 +2727,7 @@
                           </pic:cNvPicPr>
                         </pic:nvPicPr>
                         <pic:blipFill>
-                          <a:blip r:embed="rId24" cstate="none"/>
+                          <a:blip r:embed="rId25" cstate="none"/>
                           <a:srcRect/>
                           <a:stretch>
                             <a:fillRect/>
@@ -2759,7 +2831,7 @@
         <w:pStyle w:val="ListParagraph"/>
         <w:numPr>
           <w:ilvl w:val="0"/>
-          <w:numId w:val="3"/>
+          <w:numId w:val="2"/>
         </w:numPr>
         <w:spacing w:after="80" w:line="290"/>
       </w:pPr>
@@ -2787,7 +2859,7 @@
         <w:pStyle w:val="ListParagraph"/>
         <w:numPr>
           <w:ilvl w:val="0"/>
-          <w:numId w:val="3"/>
+          <w:numId w:val="2"/>
         </w:numPr>
         <w:spacing w:after="80" w:line="290"/>
       </w:pPr>
@@ -2825,7 +2897,7 @@
         <w:pStyle w:val="ListParagraph"/>
         <w:numPr>
           <w:ilvl w:val="0"/>
-          <w:numId w:val="3"/>
+          <w:numId w:val="2"/>
         </w:numPr>
         <w:spacing w:after="80" w:line="290"/>
       </w:pPr>
@@ -2863,7 +2935,7 @@
         <w:pStyle w:val="ListParagraph"/>
         <w:numPr>
           <w:ilvl w:val="0"/>
-          <w:numId w:val="3"/>
+          <w:numId w:val="2"/>
         </w:numPr>
         <w:spacing w:after="80" w:line="290"/>
       </w:pPr>
@@ -2909,7 +2981,7 @@
         <w:pStyle w:val="ListParagraph"/>
         <w:numPr>
           <w:ilvl w:val="0"/>
-          <w:numId w:val="3"/>
+          <w:numId w:val="2"/>
         </w:numPr>
         <w:spacing w:after="80" w:line="290"/>
       </w:pPr>
@@ -2957,7 +3029,7 @@
                     </pic:cNvPicPr>
                   </pic:nvPicPr>
                   <pic:blipFill>
-                    <a:blip r:embed="rId25" cstate="none"/>
+                    <a:blip r:embed="rId26" cstate="none"/>
                     <a:srcRect/>
                     <a:stretch>
                       <a:fillRect/>
@@ -3019,7 +3091,7 @@
                     </pic:cNvPicPr>
                   </pic:nvPicPr>
                   <pic:blipFill>
-                    <a:blip r:embed="rId26" cstate="none"/>
+                    <a:blip r:embed="rId27" cstate="none"/>
                     <a:srcRect/>
                     <a:stretch>
                       <a:fillRect/>
@@ -3695,12 +3767,6 @@
     </w:lvlOverride>
   </w:num>
   <w:num w:numId="2">
-    <w:abstractNumId w:val="3"/>
-    <w:lvlOverride w:ilvl="0">
-      <w:startOverride w:val="1"/>
-    </w:lvlOverride>
-  </w:num>
-  <w:num w:numId="3">
     <w:abstractNumId w:val="2"/>
     <w:lvlOverride w:ilvl="0">
       <w:startOverride w:val="1"/>

</xml_diff>